<commit_message>
update PMP.docx and update Risk_Sheet Template
</commit_message>
<xml_diff>
--- a/Process_Docs/PMP.docx
+++ b/Process_Docs/PMP.docx
@@ -189,7 +189,15 @@
           <w:sz w:val="44"/>
           <w:szCs w:val="44"/>
         </w:rPr>
-        <w:t>29/3/2026</w:t>
+        <w:t>30</w:t>
+      </w:r>
+      <w:r>
+        <w:rPr>
+          <w:rFonts w:asciiTheme="majorBidi" w:hAnsiTheme="majorBidi" w:cstheme="majorBidi"/>
+          <w:sz w:val="44"/>
+          <w:szCs w:val="44"/>
+        </w:rPr>
+        <w:t>/3/2026</w:t>
       </w:r>
     </w:p>
     <w:p>
@@ -621,37 +629,8 @@
           <w:sz w:val="36"/>
           <w:szCs w:val="36"/>
         </w:rPr>
-        <w:t>Quality Managemen</w:t>
-      </w:r>
-      <w:r>
-        <w:rPr>
-          <w:rFonts w:asciiTheme="majorBidi" w:hAnsiTheme="majorBidi" w:cstheme="majorBidi"/>
-          <w:smallCaps/>
-          <w:sz w:val="36"/>
-          <w:szCs w:val="36"/>
-        </w:rPr>
-        <w:t>t</w:t>
-      </w:r>
-      <w:r>
-        <w:rPr>
-          <w:rFonts w:asciiTheme="majorBidi" w:hAnsiTheme="majorBidi" w:cstheme="majorBidi"/>
-          <w:smallCaps/>
-          <w:sz w:val="36"/>
-          <w:szCs w:val="36"/>
-        </w:rPr>
-        <w:t xml:space="preserve"> </w:t>
-      </w:r>
-      <w:smartTag w:uri="urn:schemas-microsoft-com:office:smarttags" w:element="stockticker">
-        <w:r>
-          <w:rPr>
-            <w:rFonts w:asciiTheme="majorBidi" w:hAnsiTheme="majorBidi" w:cstheme="majorBidi"/>
-            <w:smallCaps/>
-            <w:sz w:val="36"/>
-            <w:szCs w:val="36"/>
-          </w:rPr>
-          <w:t>Plan</w:t>
-        </w:r>
-      </w:smartTag>
+        <w:t>Quality Management Plan</w:t>
+      </w:r>
       <w:r>
         <w:fldChar w:fldCharType="end"/>
       </w:r>
@@ -701,34 +680,7 @@
           <w:sz w:val="36"/>
           <w:szCs w:val="36"/>
         </w:rPr>
-        <w:t>Pro</w:t>
-      </w:r>
-      <w:r>
-        <w:rPr>
-          <w:rFonts w:asciiTheme="majorBidi" w:hAnsiTheme="majorBidi" w:cstheme="majorBidi"/>
-          <w:smallCaps/>
-          <w:sz w:val="36"/>
-          <w:szCs w:val="36"/>
-        </w:rPr>
-        <w:t>ject managem</w:t>
-      </w:r>
-      <w:r>
-        <w:rPr>
-          <w:rFonts w:asciiTheme="majorBidi" w:hAnsiTheme="majorBidi" w:cstheme="majorBidi"/>
-          <w:smallCaps/>
-          <w:sz w:val="36"/>
-          <w:szCs w:val="36"/>
-        </w:rPr>
-        <w:t>e</w:t>
-      </w:r>
-      <w:r>
-        <w:rPr>
-          <w:rFonts w:asciiTheme="majorBidi" w:hAnsiTheme="majorBidi" w:cstheme="majorBidi"/>
-          <w:smallCaps/>
-          <w:sz w:val="36"/>
-          <w:szCs w:val="36"/>
-        </w:rPr>
-        <w:t>nt plan</w:t>
+        <w:t>Project management plan</w:t>
       </w:r>
       <w:r>
         <w:fldChar w:fldCharType="end"/>
@@ -817,27 +769,7 @@
           <w:sz w:val="44"/>
           <w:szCs w:val="44"/>
         </w:rPr>
-        <w:t>Change Managemen</w:t>
-      </w:r>
-      <w:r>
-        <w:rPr>
-          <w:rStyle w:val="Hyperlink"/>
-          <w:noProof/>
-          <w:color w:val="auto"/>
-          <w:sz w:val="44"/>
-          <w:szCs w:val="44"/>
-        </w:rPr>
-        <w:t>t</w:t>
-      </w:r>
-      <w:r>
-        <w:rPr>
-          <w:rStyle w:val="Hyperlink"/>
-          <w:noProof/>
-          <w:color w:val="auto"/>
-          <w:sz w:val="44"/>
-          <w:szCs w:val="44"/>
-        </w:rPr>
-        <w:t xml:space="preserve"> Plan</w:t>
+        <w:t>Change Management Plan</w:t>
       </w:r>
       <w:r>
         <w:rPr>
@@ -1093,14 +1025,20 @@
         <w:rPr>
           <w:rFonts w:asciiTheme="majorBidi" w:hAnsiTheme="majorBidi" w:cstheme="majorBidi"/>
         </w:rPr>
-        <w:t xml:space="preserve"> project scope and Work Breakdown Structure</w:t>
+        <w:t xml:space="preserve"> project scope and </w:t>
+      </w:r>
+      <w:r>
+        <w:rPr>
+          <w:rFonts w:asciiTheme="majorBidi" w:hAnsiTheme="majorBidi" w:cstheme="majorBidi"/>
+        </w:rPr>
+        <w:t xml:space="preserve">milestone list </w:t>
       </w:r>
       <w:r>
         <w:rPr>
           <w:rFonts w:asciiTheme="majorBidi" w:hAnsiTheme="majorBidi" w:cstheme="majorBidi"/>
           <w:lang w:bidi="ar-EG"/>
         </w:rPr>
-        <w:t xml:space="preserve"> and risk management and change management and monitoring </w:t>
+        <w:t xml:space="preserve">and risk management and change management and monitoring </w:t>
       </w:r>
       <w:r>
         <w:rPr>
@@ -2428,9 +2366,9 @@
           <w:szCs w:val="36"/>
         </w:rPr>
       </w:pPr>
-      <w:bookmarkStart w:id="7" w:name="_Ref225640238"/>
-      <w:bookmarkStart w:id="8" w:name="_Toc515458337"/>
-      <w:bookmarkStart w:id="9" w:name="_Ref225710535"/>
+      <w:bookmarkStart w:id="7" w:name="_Toc515458337"/>
+      <w:bookmarkStart w:id="8" w:name="_Ref225710535"/>
+      <w:bookmarkStart w:id="9" w:name="_Ref225640238"/>
       <w:r>
         <w:rPr>
           <w:rFonts w:asciiTheme="majorBidi" w:hAnsiTheme="majorBidi" w:cstheme="majorBidi"/>
@@ -2451,8 +2389,8 @@
           <w:t>Plan</w:t>
         </w:r>
       </w:smartTag>
+      <w:bookmarkEnd w:id="7"/>
       <w:bookmarkEnd w:id="8"/>
-      <w:bookmarkEnd w:id="9"/>
     </w:p>
     <w:p>
       <w:pPr>
@@ -2532,16 +2470,7 @@
           <w:sz w:val="36"/>
           <w:szCs w:val="36"/>
         </w:rPr>
-        <w:t>Pro</w:t>
-      </w:r>
-      <w:r>
-        <w:rPr>
-          <w:rFonts w:asciiTheme="majorBidi" w:hAnsiTheme="majorBidi" w:cstheme="majorBidi"/>
-          <w:smallCaps/>
-          <w:sz w:val="36"/>
-          <w:szCs w:val="36"/>
-        </w:rPr>
-        <w:t>ject management plan</w:t>
+        <w:t>Project management plan</w:t>
       </w:r>
       <w:bookmarkEnd w:id="10"/>
     </w:p>
@@ -2690,7 +2619,7 @@
         <w:t>Change Management Plan</w:t>
       </w:r>
       <w:bookmarkEnd w:id="5"/>
-      <w:bookmarkEnd w:id="7"/>
+      <w:bookmarkEnd w:id="9"/>
     </w:p>
     <w:p>
       <w:pPr>
@@ -2759,37 +2688,12 @@
         </w:rPr>
         <w:t xml:space="preserve">evaluates </w:t>
       </w:r>
-      <w:proofErr w:type="gramStart"/>
       <w:r>
         <w:rPr>
           <w:rFonts w:asciiTheme="majorBidi" w:hAnsiTheme="majorBidi" w:cstheme="majorBidi"/>
           <w:lang w:val="en"/>
         </w:rPr>
-        <w:t>The</w:t>
-      </w:r>
-      <w:proofErr w:type="gramEnd"/>
-      <w:r>
-        <w:rPr>
-          <w:rFonts w:asciiTheme="majorBidi" w:hAnsiTheme="majorBidi" w:cstheme="majorBidi"/>
-          <w:lang w:val="en"/>
-        </w:rPr>
-        <w:t xml:space="preserve"> request and </w:t>
-      </w:r>
-      <w:proofErr w:type="gramStart"/>
-      <w:r>
-        <w:rPr>
-          <w:rFonts w:asciiTheme="majorBidi" w:hAnsiTheme="majorBidi" w:cstheme="majorBidi"/>
-          <w:lang w:val="en"/>
-        </w:rPr>
-        <w:t>send</w:t>
-      </w:r>
-      <w:proofErr w:type="gramEnd"/>
-      <w:r>
-        <w:rPr>
-          <w:rFonts w:asciiTheme="majorBidi" w:hAnsiTheme="majorBidi" w:cstheme="majorBidi"/>
-          <w:lang w:val="en"/>
-        </w:rPr>
-        <w:t xml:space="preserve"> it to Stockholders and If approved</w:t>
+        <w:t>The request and send it to Stockholders and If approved</w:t>
       </w:r>
       <w:r>
         <w:rPr>
@@ -4687,6 +4591,7 @@
   <w:style w:type="character" w:default="1" w:styleId="DefaultParagraphFont">
     <w:name w:val="Default Paragraph Font"/>
     <w:uiPriority w:val="1"/>
+    <w:semiHidden/>
     <w:unhideWhenUsed/>
   </w:style>
   <w:style w:type="table" w:default="1" w:styleId="TableNormal">

</xml_diff>